<commit_message>
sirelson crossed constructively; the wall isolated to one question)
conservation-without-prohibition and the interpenetrability sweep
</commit_message>
<xml_diff>
--- a/papers/_sources/rope_glossary_v4.docx
+++ b/papers/_sources/rope_glossary_v4.docx
@@ -535,43 +535,7 @@
     <w:p>
       <w:pPr/>
       <w:r>
-        <w:t xml:space="preserve">In Gaede’s original formulation: individual ropes interpenetrate</w:t>
-      </w:r>
-      <w:r>
-        <w:t xml:space="preserve"> </w:t>
-      </w:r>
-      <w:r>
-        <w:t xml:space="preserve">freely (unlike matter). This is correct for single ropes. HOWEVER: the</w:t>
-      </w:r>
-      <w:r>
-        <w:t xml:space="preserve"> </w:t>
-      </w:r>
-      <w:r>
-        <w:t xml:space="preserve">rope bundle theory shows that dense collections of ropes (N_eff ≫ 1)</w:t>
-      </w:r>
-      <w:r>
-        <w:t xml:space="preserve"> </w:t>
-      </w:r>
-      <w:r>
-        <w:t xml:space="preserve">generate CONTACT FORCES that resist penetration. Macroscopic solidity,</w:t>
-      </w:r>
-      <w:r>
-        <w:t xml:space="preserve"> </w:t>
-      </w:r>
-      <w:r>
-        <w:t xml:space="preserve">hardness, and impenetrability emerge from the contact condition N_eff</w:t>
-      </w:r>
-      <w:r>
-        <w:t xml:space="preserve"> </w:t>
-      </w:r>
-      <w:r>
-        <w:t xml:space="preserve">= n_rope × λ_c³ ≫ 1. Individual ropes interpenetrate; rope bundles</w:t>
-      </w:r>
-      <w:r>
-        <w:t xml:space="preserve"> </w:t>
-      </w:r>
-      <w:r>
-        <w:t xml:space="preserve">resist penetration when the coherence volume contains many ropes.</w:t>
+        <w:t>In Gaede’s original formulation: individual ropes interpenetrate freely (unlike matter). This is correct for single ropes. HOWEVER: the rope bundle theory shows that dense collections of ropes (N_eff ≫ 1) generate CONTACT FORCES that resist penetration. Macroscopic solidity, hardness, and impenetrability emerge from the contact condition N_eff = n_rope × λ_c³ ≫ 1. Individual ropes interpenetrate; rope bundles resist penetration when the coherence volume contains many ropes. UPDATE (July 2026, FND-KIN-005): the dynamical half is now verified — net topological counts (charge-class quantities) are identity-protected through ALL smooth events including pair creation/annihilation (boundary count exact to machine precision through a measured annihilation), and the contact overlap is finite at zero separation. The framework contains no crossing axiom at any level, and needs none: interpenetration is primitive, tangibility is emergent density energetics, and conservation is arithmetic.</w:t>
       </w:r>
     </w:p>
     <w:p>

</xml_diff>